<commit_message>
Añade migraciones de Identity y actualiza documentos pruebas
Se agregan las migraciones de Entity Framework Core para el esquema de ASP.NET Core Identity, creando las tablas necesarias para la gestión de usuarios y roles. Además, se elimina el archivo de prueba `CasoDePruebas_ComprarBonoBocadilloFunciona.docx` y se modifica el archivo `CasoDePruebas_PedirBocadillo.docx`.
</commit_message>
<xml_diff>
--- a/test/AppForSEII2526.UIT/PedirBocadillo_UIT/CasoDePruebas_PedirBocadillo.docx
+++ b/test/AppForSEII2526.UIT/PedirBocadillo_UIT/CasoDePruebas_PedirBocadillo.docx
@@ -85,21 +85,12 @@
           <w:lang w:val="es-ES"/>
         </w:rPr>
       </w:pPr>
-      <w:proofErr w:type="spellStart"/>
       <w:r>
         <w:rPr>
           <w:sz w:val="28"/>
           <w:lang w:val="es-ES"/>
         </w:rPr>
-        <w:t>Version</w:t>
-      </w:r>
-      <w:proofErr w:type="spellEnd"/>
-      <w:r>
-        <w:rPr>
-          <w:sz w:val="28"/>
-          <w:lang w:val="es-ES"/>
-        </w:rPr>
-        <w:t xml:space="preserve"> &lt;1.0&gt;</w:t>
+        <w:t>Version &lt;1.0&gt;</w:t>
       </w:r>
     </w:p>
     <w:p>
@@ -322,49 +313,7 @@
               <w:rPr>
                 <w:lang w:val="es-ES"/>
               </w:rPr>
-              <w:t>&lt;</w:t>
-            </w:r>
-            <w:proofErr w:type="spellStart"/>
-            <w:r>
-              <w:rPr>
-                <w:lang w:val="es-ES"/>
-              </w:rPr>
-              <w:t>dd</w:t>
-            </w:r>
-            <w:proofErr w:type="spellEnd"/>
-            <w:r>
-              <w:rPr>
-                <w:lang w:val="es-ES"/>
-              </w:rPr>
-              <w:t>/</w:t>
-            </w:r>
-            <w:proofErr w:type="spellStart"/>
-            <w:r>
-              <w:rPr>
-                <w:lang w:val="es-ES"/>
-              </w:rPr>
-              <w:t>mmm</w:t>
-            </w:r>
-            <w:proofErr w:type="spellEnd"/>
-            <w:r>
-              <w:rPr>
-                <w:lang w:val="es-ES"/>
-              </w:rPr>
-              <w:t>/</w:t>
-            </w:r>
-            <w:proofErr w:type="spellStart"/>
-            <w:r>
-              <w:rPr>
-                <w:lang w:val="es-ES"/>
-              </w:rPr>
-              <w:t>yy</w:t>
-            </w:r>
-            <w:proofErr w:type="spellEnd"/>
-            <w:r>
-              <w:rPr>
-                <w:lang w:val="es-ES"/>
-              </w:rPr>
-              <w:t>&gt;</w:t>
+              <w:t>&lt;dd/mmm/yy&gt;</w:t>
             </w:r>
           </w:p>
         </w:tc>
@@ -383,21 +332,7 @@
               <w:rPr>
                 <w:lang w:val="es-ES"/>
               </w:rPr>
-              <w:t>&lt;</w:t>
-            </w:r>
-            <w:proofErr w:type="spellStart"/>
-            <w:r>
-              <w:rPr>
-                <w:lang w:val="es-ES"/>
-              </w:rPr>
-              <w:t>x.x</w:t>
-            </w:r>
-            <w:proofErr w:type="spellEnd"/>
-            <w:r>
-              <w:rPr>
-                <w:lang w:val="es-ES"/>
-              </w:rPr>
-              <w:t>&gt;</w:t>
+              <w:t>&lt;x.x&gt;</w:t>
             </w:r>
           </w:p>
         </w:tc>
@@ -416,21 +351,7 @@
               <w:rPr>
                 <w:lang w:val="es-ES"/>
               </w:rPr>
-              <w:t>&lt;</w:t>
-            </w:r>
-            <w:proofErr w:type="spellStart"/>
-            <w:r>
-              <w:rPr>
-                <w:lang w:val="es-ES"/>
-              </w:rPr>
-              <w:t>details</w:t>
-            </w:r>
-            <w:proofErr w:type="spellEnd"/>
-            <w:r>
-              <w:rPr>
-                <w:lang w:val="es-ES"/>
-              </w:rPr>
-              <w:t>&gt;</w:t>
+              <w:t>&lt;details&gt;</w:t>
             </w:r>
           </w:p>
         </w:tc>
@@ -449,21 +370,7 @@
               <w:rPr>
                 <w:lang w:val="es-ES"/>
               </w:rPr>
-              <w:t>&lt;</w:t>
-            </w:r>
-            <w:proofErr w:type="spellStart"/>
-            <w:r>
-              <w:rPr>
-                <w:lang w:val="es-ES"/>
-              </w:rPr>
-              <w:t>name</w:t>
-            </w:r>
-            <w:proofErr w:type="spellEnd"/>
-            <w:r>
-              <w:rPr>
-                <w:lang w:val="es-ES"/>
-              </w:rPr>
-              <w:t>&gt;</w:t>
+              <w:t>&lt;name&gt;</w:t>
             </w:r>
           </w:p>
         </w:tc>
@@ -685,6 +592,13 @@
     </w:p>
     <w:sdt>
       <w:sdtPr>
+        <w:rPr>
+          <w:rFonts w:ascii="Verdana" w:eastAsia="Times New Roman" w:hAnsi="Verdana" w:cs="Times New Roman"/>
+          <w:color w:val="auto"/>
+          <w:sz w:val="20"/>
+          <w:szCs w:val="20"/>
+          <w:lang w:val="en-US" w:eastAsia="en-US"/>
+        </w:rPr>
         <w:id w:val="1053661479"/>
         <w:docPartObj>
           <w:docPartGallery w:val="Table of Contents"/>
@@ -693,13 +607,8 @@
       </w:sdtPr>
       <w:sdtEndPr>
         <w:rPr>
-          <w:rFonts w:ascii="Verdana" w:eastAsia="Times New Roman" w:hAnsi="Verdana" w:cs="Times New Roman"/>
           <w:b/>
           <w:bCs/>
-          <w:color w:val="auto"/>
-          <w:sz w:val="20"/>
-          <w:szCs w:val="20"/>
-          <w:lang w:val="en-US" w:eastAsia="en-US"/>
         </w:rPr>
       </w:sdtEndPr>
       <w:sdtContent>
@@ -1527,13 +1436,8 @@
         <w:t>Casos</w:t>
       </w:r>
       <w:r>
-        <w:t xml:space="preserve"> de </w:t>
-      </w:r>
-      <w:proofErr w:type="spellStart"/>
-      <w:r>
-        <w:t>Pruebas</w:t>
-      </w:r>
-      <w:proofErr w:type="spellEnd"/>
+        <w:t xml:space="preserve"> de Pruebas</w:t>
+      </w:r>
       <w:r>
         <w:fldChar w:fldCharType="end"/>
       </w:r>
@@ -1546,9 +1450,9 @@
         </w:rPr>
       </w:pPr>
       <w:bookmarkStart w:id="0" w:name="_Toc278820252"/>
-      <w:bookmarkStart w:id="1" w:name="_Toc436203377"/>
-      <w:bookmarkStart w:id="2" w:name="_Toc452813577"/>
-      <w:bookmarkStart w:id="3" w:name="_Toc216523434"/>
+      <w:bookmarkStart w:id="1" w:name="_Toc216523434"/>
+      <w:bookmarkStart w:id="2" w:name="_Toc436203377"/>
+      <w:bookmarkStart w:id="3" w:name="_Toc452813577"/>
       <w:r>
         <w:rPr>
           <w:lang w:val="es-ES"/>
@@ -1556,7 +1460,7 @@
         <w:t>Elementos de prueba</w:t>
       </w:r>
       <w:bookmarkEnd w:id="0"/>
-      <w:bookmarkEnd w:id="3"/>
+      <w:bookmarkEnd w:id="1"/>
     </w:p>
     <w:p>
       <w:pPr>
@@ -1575,16 +1479,7 @@
           <w:sz w:val="20"/>
           <w:szCs w:val="20"/>
         </w:rPr>
-        <w:t>El elemento para probar</w:t>
-      </w:r>
-      <w:r>
-        <w:rPr>
-          <w:rStyle w:val="citation-82"/>
-          <w:rFonts w:ascii="Verdana" w:hAnsi="Verdana"/>
-          <w:sz w:val="20"/>
-          <w:szCs w:val="20"/>
-        </w:rPr>
-        <w:t xml:space="preserve"> es la funcionalidad de Realizar Pedido de Bocadillos dentro del sistema de la Tienda de bocadillos</w:t>
+        <w:t>El elemento para probar es la funcionalidad de Realizar Pedido de Bocadillos dentro del sistema de la Tienda de bocadillos</w:t>
       </w:r>
       <w:r>
         <w:rPr>
@@ -1705,37 +1600,8 @@
                 <w:lang w:val="es-ES"/>
               </w:rPr>
             </w:pPr>
-            <w:proofErr w:type="spellStart"/>
-            <w:r>
-              <w:t>Flujo</w:t>
-            </w:r>
-            <w:proofErr w:type="spellEnd"/>
-            <w:r>
-              <w:t xml:space="preserve"> </w:t>
-            </w:r>
-            <w:proofErr w:type="spellStart"/>
-            <w:r>
-              <w:t>Básico</w:t>
-            </w:r>
-            <w:proofErr w:type="spellEnd"/>
-            <w:r>
-              <w:t xml:space="preserve"> (</w:t>
-            </w:r>
-            <w:proofErr w:type="spellStart"/>
-            <w:r>
-              <w:t>Compra</w:t>
-            </w:r>
-            <w:proofErr w:type="spellEnd"/>
-            <w:r>
-              <w:t xml:space="preserve"> </w:t>
-            </w:r>
-            <w:proofErr w:type="spellStart"/>
-            <w:r>
-              <w:t>Exitosa</w:t>
-            </w:r>
-            <w:proofErr w:type="spellEnd"/>
-            <w:r>
-              <w:t>)</w:t>
+            <w:r>
+              <w:t>Flujo Básico (Compra Exitosa)</w:t>
             </w:r>
           </w:p>
         </w:tc>
@@ -1807,29 +1673,8 @@
                 <w:lang w:val="es-ES"/>
               </w:rPr>
             </w:pPr>
-            <w:proofErr w:type="spellStart"/>
-            <w:r>
-              <w:t>Flujo</w:t>
-            </w:r>
-            <w:proofErr w:type="spellEnd"/>
-            <w:r>
-              <w:t xml:space="preserve"> Alternativo 2 (</w:t>
-            </w:r>
-            <w:proofErr w:type="spellStart"/>
-            <w:r>
-              <w:t>Carrito</w:t>
-            </w:r>
-            <w:proofErr w:type="spellEnd"/>
-            <w:r>
-              <w:t xml:space="preserve"> </w:t>
-            </w:r>
-            <w:proofErr w:type="spellStart"/>
-            <w:r>
-              <w:t>vacío</w:t>
-            </w:r>
-            <w:proofErr w:type="spellEnd"/>
-            <w:r>
-              <w:t>)</w:t>
+            <w:r>
+              <w:t>Flujo Alternativo 2 (Carrito vacío)</w:t>
             </w:r>
           </w:p>
         </w:tc>
@@ -2117,21 +1962,7 @@
               <w:rPr>
                 <w:lang w:val="es-ES"/>
               </w:rPr>
-              <w:t xml:space="preserve">Usuario </w:t>
-            </w:r>
-            <w:proofErr w:type="spellStart"/>
-            <w:r>
-              <w:rPr>
-                <w:lang w:val="es-ES"/>
-              </w:rPr>
-              <w:t>logueado</w:t>
-            </w:r>
-            <w:proofErr w:type="spellEnd"/>
-            <w:r>
-              <w:rPr>
-                <w:lang w:val="es-ES"/>
-              </w:rPr>
-              <w:t>, bocadillos disponibles. Compra estándar.</w:t>
+              <w:t>Usuario logueado, bocadillos disponibles. Compra estándar.</w:t>
             </w:r>
           </w:p>
         </w:tc>
@@ -2161,21 +1992,7 @@
               <w:rPr>
                 <w:lang w:val="es-ES"/>
               </w:rPr>
-              <w:t>" (</w:t>
-            </w:r>
-            <w:proofErr w:type="spellStart"/>
-            <w:r>
-              <w:rPr>
-                <w:lang w:val="es-ES"/>
-              </w:rPr>
-              <w:t>Cant</w:t>
-            </w:r>
-            <w:proofErr w:type="spellEnd"/>
-            <w:r>
-              <w:rPr>
-                <w:lang w:val="es-ES"/>
-              </w:rPr>
-              <w:t>: 1). Clic en "Tramitar".</w:t>
+              <w:t>" (Cant: 1). Clic en "Tramitar".</w:t>
             </w:r>
           </w:p>
         </w:tc>
@@ -2193,51 +2010,10 @@
               <w:rPr>
                 <w:lang w:val="es-ES"/>
               </w:rPr>
-              <w:t>Nombre: "</w:t>
-            </w:r>
-            <w:proofErr w:type="spellStart"/>
-            <w:r>
-              <w:rPr>
-                <w:lang w:val="es-ES"/>
-              </w:rPr>
-              <w:t>SeleniumUser</w:t>
-            </w:r>
-            <w:proofErr w:type="spellEnd"/>
-            <w:r>
-              <w:rPr>
-                <w:lang w:val="es-ES"/>
-              </w:rPr>
-              <w:t>", Email: "uit@test.com", Pago: "</w:t>
-            </w:r>
-            <w:proofErr w:type="spellStart"/>
-            <w:r>
-              <w:rPr>
-                <w:lang w:val="es-ES"/>
-              </w:rPr>
-              <w:t>GooglePay</w:t>
-            </w:r>
-            <w:proofErr w:type="spellEnd"/>
-            <w:r>
-              <w:rPr>
-                <w:lang w:val="es-ES"/>
-              </w:rPr>
-              <w:t xml:space="preserve">". </w:t>
-            </w:r>
-            <w:proofErr w:type="spellStart"/>
-            <w:r>
-              <w:t>Clic</w:t>
-            </w:r>
-            <w:proofErr w:type="spellEnd"/>
-            <w:r>
-              <w:t xml:space="preserve"> "</w:t>
-            </w:r>
-            <w:proofErr w:type="spellStart"/>
-            <w:r>
-              <w:t>Confirmar</w:t>
-            </w:r>
-            <w:proofErr w:type="spellEnd"/>
-            <w:r>
-              <w:t>".</w:t>
+              <w:t xml:space="preserve">Nombre: "SeleniumUser", Email: "uit@test.com", Pago: "GooglePay". </w:t>
+            </w:r>
+            <w:r>
+              <w:t>Clic "Confirmar".</w:t>
             </w:r>
           </w:p>
         </w:tc>
@@ -2267,35 +2043,7 @@
               <w:rPr>
                 <w:lang w:val="es-ES"/>
               </w:rPr>
-              <w:t xml:space="preserve">El sistema redirige a la página de </w:t>
-            </w:r>
-            <w:proofErr w:type="spellStart"/>
-            <w:r>
-              <w:rPr>
-                <w:lang w:val="es-ES"/>
-              </w:rPr>
-              <w:t>DetallePedido</w:t>
-            </w:r>
-            <w:proofErr w:type="spellEnd"/>
-            <w:r>
-              <w:rPr>
-                <w:lang w:val="es-ES"/>
-              </w:rPr>
-              <w:t>. Muestra los datos del cliente ("</w:t>
-            </w:r>
-            <w:proofErr w:type="spellStart"/>
-            <w:r>
-              <w:rPr>
-                <w:lang w:val="es-ES"/>
-              </w:rPr>
-              <w:t>SeleniumUser</w:t>
-            </w:r>
-            <w:proofErr w:type="spellEnd"/>
-            <w:r>
-              <w:rPr>
-                <w:lang w:val="es-ES"/>
-              </w:rPr>
-              <w:t>") y el método de pago seleccionado.</w:t>
+              <w:t>El sistema redirige a la página de DetallePedido. Muestra los datos del cliente ("SeleniumUser") y el método de pago seleccionado.</w:t>
             </w:r>
           </w:p>
         </w:tc>
@@ -2481,23 +2229,7 @@
               </w:rPr>
             </w:pPr>
             <w:r>
-              <w:t xml:space="preserve">No </w:t>
-            </w:r>
-            <w:proofErr w:type="spellStart"/>
-            <w:r>
-              <w:t>selecciona</w:t>
-            </w:r>
-            <w:proofErr w:type="spellEnd"/>
-            <w:r>
-              <w:t xml:space="preserve"> </w:t>
-            </w:r>
-            <w:proofErr w:type="spellStart"/>
-            <w:r>
-              <w:t>ningún</w:t>
-            </w:r>
-            <w:proofErr w:type="spellEnd"/>
-            <w:r>
-              <w:t xml:space="preserve"> bocadillo.</w:t>
+              <w:t>No selecciona ningún bocadillo.</w:t>
             </w:r>
           </w:p>
         </w:tc>
@@ -2763,21 +2495,7 @@
               <w:rPr>
                 <w:lang w:val="es-ES"/>
               </w:rPr>
-              <w:t>redirige al detalle. Muestra mensajes de validación y mantiene al usuario en la página del formulario (/</w:t>
-            </w:r>
-            <w:proofErr w:type="spellStart"/>
-            <w:r>
-              <w:rPr>
-                <w:lang w:val="es-ES"/>
-              </w:rPr>
-              <w:t>Create</w:t>
-            </w:r>
-            <w:proofErr w:type="spellEnd"/>
-            <w:r>
-              <w:rPr>
-                <w:lang w:val="es-ES"/>
-              </w:rPr>
-              <w:t>)</w:t>
+              <w:t>redirige al detalle. Muestra mensajes de validación y mantiene al usuario en la página del formulario (/Create)</w:t>
             </w:r>
           </w:p>
         </w:tc>
@@ -2848,15 +2566,7 @@
               </w:rPr>
             </w:pPr>
             <w:r>
-              <w:t>Rellena Nombre: "</w:t>
-            </w:r>
-            <w:proofErr w:type="spellStart"/>
-            <w:r>
-              <w:t>NombrePersistente</w:t>
-            </w:r>
-            <w:proofErr w:type="spellEnd"/>
-            <w:r>
-              <w:t>".</w:t>
+              <w:t>Rellena Nombre: "NombrePersistente".</w:t>
             </w:r>
           </w:p>
         </w:tc>
@@ -2886,21 +2596,7 @@
               <w:rPr>
                 <w:lang w:val="es-ES"/>
               </w:rPr>
-              <w:t>Al volver al formulario, el campo "Nombre" mantiene el valor "</w:t>
-            </w:r>
-            <w:proofErr w:type="spellStart"/>
-            <w:r>
-              <w:rPr>
-                <w:lang w:val="es-ES"/>
-              </w:rPr>
-              <w:t>NombrePersistente</w:t>
-            </w:r>
-            <w:proofErr w:type="spellEnd"/>
-            <w:r>
-              <w:rPr>
-                <w:lang w:val="es-ES"/>
-              </w:rPr>
-              <w:t>" introducido previamente (Persistencia de estado)</w:t>
+              <w:t>Al volver al formulario, el campo "Nombre" mantiene el valor "NombrePersistente" introducido previamente (Persistencia de estado)</w:t>
             </w:r>
           </w:p>
         </w:tc>
@@ -3028,25 +2724,7 @@
           <w:sz w:val="20"/>
           <w:szCs w:val="20"/>
         </w:rPr>
-        <w:t xml:space="preserve">Navegador Microsoft Edge (para pruebas </w:t>
-      </w:r>
-      <w:proofErr w:type="spellStart"/>
-      <w:r>
-        <w:rPr>
-          <w:rFonts w:ascii="Verdana" w:hAnsi="Verdana"/>
-          <w:sz w:val="20"/>
-          <w:szCs w:val="20"/>
-        </w:rPr>
-        <w:t>Selenium</w:t>
-      </w:r>
-      <w:proofErr w:type="spellEnd"/>
-      <w:r>
-        <w:rPr>
-          <w:rFonts w:ascii="Verdana" w:hAnsi="Verdana"/>
-          <w:sz w:val="20"/>
-          <w:szCs w:val="20"/>
-        </w:rPr>
-        <w:t>).</w:t>
+        <w:t>Navegador Microsoft Edge (para pruebas Selenium).</w:t>
       </w:r>
     </w:p>
     <w:p>
@@ -3224,27 +2902,119 @@
       <w:bookmarkEnd w:id="16"/>
       <w:bookmarkEnd w:id="17"/>
     </w:p>
-    <w:bookmarkEnd w:id="1"/>
     <w:bookmarkEnd w:id="2"/>
+    <w:bookmarkEnd w:id="3"/>
     <w:p>
       <w:pPr>
         <w:rPr>
           <w:lang w:val="es-ES"/>
         </w:rPr>
       </w:pPr>
-      <w:proofErr w:type="spellStart"/>
-      <w:r>
-        <w:rPr>
-          <w:lang w:val="es-ES"/>
-        </w:rPr>
-        <w:t>Login</w:t>
-      </w:r>
-      <w:proofErr w:type="spellEnd"/>
-      <w:r>
-        <w:rPr>
-          <w:lang w:val="es-ES"/>
-        </w:rPr>
-        <w:t xml:space="preserve"> de Usuario: Aunque el sistema permite emails anónimos, se recomienda un usuario registrado si se valida la autenticación en el controlador.</w:t>
+      <w:r>
+        <w:rPr>
+          <w:lang w:val="es-ES"/>
+        </w:rPr>
+        <w:t>Login de Usuario: Aunque el sistema permite emails anónimos, se recomienda un usuario registrado si se valida la autenticación en el controlador.</w:t>
+      </w:r>
+      <w:r>
+        <w:rPr>
+          <w:lang w:val="es-ES"/>
+        </w:rPr>
+        <w:br/>
+      </w:r>
+      <w:r>
+        <w:rPr>
+          <w:lang w:val="es-ES"/>
+        </w:rPr>
+        <w:br/>
+        <w:t>Datos con los que trabajo:</w:t>
+      </w:r>
+    </w:p>
+    <w:p>
+      <w:pPr>
+        <w:rPr>
+          <w:lang w:val="es-ES"/>
+        </w:rPr>
+      </w:pPr>
+      <w:r>
+        <w:rPr>
+          <w:lang w:val="es-ES"/>
+        </w:rPr>
+        <w:drawing>
+          <wp:inline distT="0" distB="0" distL="0" distR="0" wp14:anchorId="21B2ABA0" wp14:editId="5DEDC79F">
+            <wp:extent cx="2467319" cy="743054"/>
+            <wp:effectExtent l="0" t="0" r="0" b="0"/>
+            <wp:docPr id="676535314" name="Imagen 1" descr="Imagen que contiene Interfaz de usuario gráfica&#10;&#10;El contenido generado por IA puede ser incorrecto."/>
+            <wp:cNvGraphicFramePr>
+              <a:graphicFrameLocks xmlns:a="http://schemas.openxmlformats.org/drawingml/2006/main" noChangeAspect="1"/>
+            </wp:cNvGraphicFramePr>
+            <a:graphic xmlns:a="http://schemas.openxmlformats.org/drawingml/2006/main">
+              <a:graphicData uri="http://schemas.openxmlformats.org/drawingml/2006/picture">
+                <pic:pic xmlns:pic="http://schemas.openxmlformats.org/drawingml/2006/picture">
+                  <pic:nvPicPr>
+                    <pic:cNvPr id="676535314" name="Imagen 1" descr="Imagen que contiene Interfaz de usuario gráfica&#10;&#10;El contenido generado por IA puede ser incorrecto."/>
+                    <pic:cNvPicPr/>
+                  </pic:nvPicPr>
+                  <pic:blipFill>
+                    <a:blip r:embed="rId11"/>
+                    <a:stretch>
+                      <a:fillRect/>
+                    </a:stretch>
+                  </pic:blipFill>
+                  <pic:spPr>
+                    <a:xfrm>
+                      <a:off x="0" y="0"/>
+                      <a:ext cx="2467319" cy="743054"/>
+                    </a:xfrm>
+                    <a:prstGeom prst="rect">
+                      <a:avLst/>
+                    </a:prstGeom>
+                  </pic:spPr>
+                </pic:pic>
+              </a:graphicData>
+            </a:graphic>
+          </wp:inline>
+        </w:drawing>
+      </w:r>
+      <w:r>
+        <w:rPr>
+          <w:lang w:val="es-ES"/>
+        </w:rPr>
+        <w:drawing>
+          <wp:inline distT="0" distB="0" distL="0" distR="0" wp14:anchorId="1D0C463D" wp14:editId="4952043F">
+            <wp:extent cx="6735115" cy="885949"/>
+            <wp:effectExtent l="0" t="0" r="0" b="9525"/>
+            <wp:docPr id="468147929" name="Imagen 1" descr="Interfaz de usuario gráfica, Aplicación&#10;&#10;El contenido generado por IA puede ser incorrecto."/>
+            <wp:cNvGraphicFramePr>
+              <a:graphicFrameLocks xmlns:a="http://schemas.openxmlformats.org/drawingml/2006/main" noChangeAspect="1"/>
+            </wp:cNvGraphicFramePr>
+            <a:graphic xmlns:a="http://schemas.openxmlformats.org/drawingml/2006/main">
+              <a:graphicData uri="http://schemas.openxmlformats.org/drawingml/2006/picture">
+                <pic:pic xmlns:pic="http://schemas.openxmlformats.org/drawingml/2006/picture">
+                  <pic:nvPicPr>
+                    <pic:cNvPr id="468147929" name="Imagen 1" descr="Interfaz de usuario gráfica, Aplicación&#10;&#10;El contenido generado por IA puede ser incorrecto."/>
+                    <pic:cNvPicPr/>
+                  </pic:nvPicPr>
+                  <pic:blipFill>
+                    <a:blip r:embed="rId12"/>
+                    <a:stretch>
+                      <a:fillRect/>
+                    </a:stretch>
+                  </pic:blipFill>
+                  <pic:spPr>
+                    <a:xfrm>
+                      <a:off x="0" y="0"/>
+                      <a:ext cx="6735115" cy="885949"/>
+                    </a:xfrm>
+                    <a:prstGeom prst="rect">
+                      <a:avLst/>
+                    </a:prstGeom>
+                  </pic:spPr>
+                </pic:pic>
+              </a:graphicData>
+            </a:graphic>
+          </wp:inline>
+        </w:drawing>
       </w:r>
     </w:p>
     <w:sectPr>
@@ -3557,26 +3327,11 @@
           <w:tcW w:w="6379" w:type="dxa"/>
         </w:tcPr>
         <w:p>
-          <w:r>
-            <w:fldChar w:fldCharType="begin"/>
-          </w:r>
-          <w:r>
-            <w:instrText xml:space="preserve"> TITLE  \* MERGEFORMAT </w:instrText>
-          </w:r>
-          <w:r>
-            <w:fldChar w:fldCharType="separate"/>
-          </w:r>
-          <w:r>
-            <w:t xml:space="preserve">Casos de </w:t>
-          </w:r>
-          <w:proofErr w:type="spellStart"/>
-          <w:r>
-            <w:t>Pruebas</w:t>
-          </w:r>
-          <w:proofErr w:type="spellEnd"/>
-          <w:r>
-            <w:fldChar w:fldCharType="end"/>
-          </w:r>
+          <w:fldSimple w:instr=" TITLE  \* MERGEFORMAT ">
+            <w:r>
+              <w:t>Casos de Pruebas</w:t>
+            </w:r>
+          </w:fldSimple>
         </w:p>
       </w:tc>
       <w:tc>
@@ -3585,15 +3340,7 @@
         </w:tcPr>
         <w:p>
           <w:r>
-            <w:t xml:space="preserve">  </w:t>
-          </w:r>
-          <w:proofErr w:type="spellStart"/>
-          <w:r>
-            <w:t>Fecha</w:t>
-          </w:r>
-          <w:proofErr w:type="spellEnd"/>
-          <w:r>
-            <w:t xml:space="preserve">:  </w:t>
+            <w:t xml:space="preserve">  Fecha:  </w:t>
           </w:r>
           <w:r>
             <w:t>13/12/2025</w:t>
@@ -4559,6 +4306,7 @@
   <w:style w:type="character" w:default="1" w:styleId="Fuentedeprrafopredeter">
     <w:name w:val="Default Paragraph Font"/>
     <w:uiPriority w:val="1"/>
+    <w:semiHidden/>
     <w:unhideWhenUsed/>
   </w:style>
   <w:style w:type="table" w:default="1" w:styleId="Tablanormal">

</xml_diff>

<commit_message>
Añade migraciones de Identity y actualiza documentos pruebas (#181)
Se agregan las migraciones de Entity Framework Core para el esquema de ASP.NET Core Identity, creando las tablas necesarias para la gestión de usuarios y roles. Además, se elimina el archivo de prueba `CasoDePruebas_ComprarBonoBocadilloFunciona.docx` y se modifica el archivo `CasoDePruebas_PedirBocadillo.docx`.
</commit_message>
<xml_diff>
--- a/test/AppForSEII2526.UIT/PedirBocadillo_UIT/CasoDePruebas_PedirBocadillo.docx
+++ b/test/AppForSEII2526.UIT/PedirBocadillo_UIT/CasoDePruebas_PedirBocadillo.docx
@@ -85,21 +85,12 @@
           <w:lang w:val="es-ES"/>
         </w:rPr>
       </w:pPr>
-      <w:proofErr w:type="spellStart"/>
       <w:r>
         <w:rPr>
           <w:sz w:val="28"/>
           <w:lang w:val="es-ES"/>
         </w:rPr>
-        <w:t>Version</w:t>
-      </w:r>
-      <w:proofErr w:type="spellEnd"/>
-      <w:r>
-        <w:rPr>
-          <w:sz w:val="28"/>
-          <w:lang w:val="es-ES"/>
-        </w:rPr>
-        <w:t xml:space="preserve"> &lt;1.0&gt;</w:t>
+        <w:t>Version &lt;1.0&gt;</w:t>
       </w:r>
     </w:p>
     <w:p>
@@ -322,49 +313,7 @@
               <w:rPr>
                 <w:lang w:val="es-ES"/>
               </w:rPr>
-              <w:t>&lt;</w:t>
-            </w:r>
-            <w:proofErr w:type="spellStart"/>
-            <w:r>
-              <w:rPr>
-                <w:lang w:val="es-ES"/>
-              </w:rPr>
-              <w:t>dd</w:t>
-            </w:r>
-            <w:proofErr w:type="spellEnd"/>
-            <w:r>
-              <w:rPr>
-                <w:lang w:val="es-ES"/>
-              </w:rPr>
-              <w:t>/</w:t>
-            </w:r>
-            <w:proofErr w:type="spellStart"/>
-            <w:r>
-              <w:rPr>
-                <w:lang w:val="es-ES"/>
-              </w:rPr>
-              <w:t>mmm</w:t>
-            </w:r>
-            <w:proofErr w:type="spellEnd"/>
-            <w:r>
-              <w:rPr>
-                <w:lang w:val="es-ES"/>
-              </w:rPr>
-              <w:t>/</w:t>
-            </w:r>
-            <w:proofErr w:type="spellStart"/>
-            <w:r>
-              <w:rPr>
-                <w:lang w:val="es-ES"/>
-              </w:rPr>
-              <w:t>yy</w:t>
-            </w:r>
-            <w:proofErr w:type="spellEnd"/>
-            <w:r>
-              <w:rPr>
-                <w:lang w:val="es-ES"/>
-              </w:rPr>
-              <w:t>&gt;</w:t>
+              <w:t>&lt;dd/mmm/yy&gt;</w:t>
             </w:r>
           </w:p>
         </w:tc>
@@ -383,21 +332,7 @@
               <w:rPr>
                 <w:lang w:val="es-ES"/>
               </w:rPr>
-              <w:t>&lt;</w:t>
-            </w:r>
-            <w:proofErr w:type="spellStart"/>
-            <w:r>
-              <w:rPr>
-                <w:lang w:val="es-ES"/>
-              </w:rPr>
-              <w:t>x.x</w:t>
-            </w:r>
-            <w:proofErr w:type="spellEnd"/>
-            <w:r>
-              <w:rPr>
-                <w:lang w:val="es-ES"/>
-              </w:rPr>
-              <w:t>&gt;</w:t>
+              <w:t>&lt;x.x&gt;</w:t>
             </w:r>
           </w:p>
         </w:tc>
@@ -416,21 +351,7 @@
               <w:rPr>
                 <w:lang w:val="es-ES"/>
               </w:rPr>
-              <w:t>&lt;</w:t>
-            </w:r>
-            <w:proofErr w:type="spellStart"/>
-            <w:r>
-              <w:rPr>
-                <w:lang w:val="es-ES"/>
-              </w:rPr>
-              <w:t>details</w:t>
-            </w:r>
-            <w:proofErr w:type="spellEnd"/>
-            <w:r>
-              <w:rPr>
-                <w:lang w:val="es-ES"/>
-              </w:rPr>
-              <w:t>&gt;</w:t>
+              <w:t>&lt;details&gt;</w:t>
             </w:r>
           </w:p>
         </w:tc>
@@ -449,21 +370,7 @@
               <w:rPr>
                 <w:lang w:val="es-ES"/>
               </w:rPr>
-              <w:t>&lt;</w:t>
-            </w:r>
-            <w:proofErr w:type="spellStart"/>
-            <w:r>
-              <w:rPr>
-                <w:lang w:val="es-ES"/>
-              </w:rPr>
-              <w:t>name</w:t>
-            </w:r>
-            <w:proofErr w:type="spellEnd"/>
-            <w:r>
-              <w:rPr>
-                <w:lang w:val="es-ES"/>
-              </w:rPr>
-              <w:t>&gt;</w:t>
+              <w:t>&lt;name&gt;</w:t>
             </w:r>
           </w:p>
         </w:tc>
@@ -685,6 +592,13 @@
     </w:p>
     <w:sdt>
       <w:sdtPr>
+        <w:rPr>
+          <w:rFonts w:ascii="Verdana" w:eastAsia="Times New Roman" w:hAnsi="Verdana" w:cs="Times New Roman"/>
+          <w:color w:val="auto"/>
+          <w:sz w:val="20"/>
+          <w:szCs w:val="20"/>
+          <w:lang w:val="en-US" w:eastAsia="en-US"/>
+        </w:rPr>
         <w:id w:val="1053661479"/>
         <w:docPartObj>
           <w:docPartGallery w:val="Table of Contents"/>
@@ -693,13 +607,8 @@
       </w:sdtPr>
       <w:sdtEndPr>
         <w:rPr>
-          <w:rFonts w:ascii="Verdana" w:eastAsia="Times New Roman" w:hAnsi="Verdana" w:cs="Times New Roman"/>
           <w:b/>
           <w:bCs/>
-          <w:color w:val="auto"/>
-          <w:sz w:val="20"/>
-          <w:szCs w:val="20"/>
-          <w:lang w:val="en-US" w:eastAsia="en-US"/>
         </w:rPr>
       </w:sdtEndPr>
       <w:sdtContent>
@@ -1527,13 +1436,8 @@
         <w:t>Casos</w:t>
       </w:r>
       <w:r>
-        <w:t xml:space="preserve"> de </w:t>
-      </w:r>
-      <w:proofErr w:type="spellStart"/>
-      <w:r>
-        <w:t>Pruebas</w:t>
-      </w:r>
-      <w:proofErr w:type="spellEnd"/>
+        <w:t xml:space="preserve"> de Pruebas</w:t>
+      </w:r>
       <w:r>
         <w:fldChar w:fldCharType="end"/>
       </w:r>
@@ -1546,9 +1450,9 @@
         </w:rPr>
       </w:pPr>
       <w:bookmarkStart w:id="0" w:name="_Toc278820252"/>
-      <w:bookmarkStart w:id="1" w:name="_Toc436203377"/>
-      <w:bookmarkStart w:id="2" w:name="_Toc452813577"/>
-      <w:bookmarkStart w:id="3" w:name="_Toc216523434"/>
+      <w:bookmarkStart w:id="1" w:name="_Toc216523434"/>
+      <w:bookmarkStart w:id="2" w:name="_Toc436203377"/>
+      <w:bookmarkStart w:id="3" w:name="_Toc452813577"/>
       <w:r>
         <w:rPr>
           <w:lang w:val="es-ES"/>
@@ -1556,7 +1460,7 @@
         <w:t>Elementos de prueba</w:t>
       </w:r>
       <w:bookmarkEnd w:id="0"/>
-      <w:bookmarkEnd w:id="3"/>
+      <w:bookmarkEnd w:id="1"/>
     </w:p>
     <w:p>
       <w:pPr>
@@ -1575,16 +1479,7 @@
           <w:sz w:val="20"/>
           <w:szCs w:val="20"/>
         </w:rPr>
-        <w:t>El elemento para probar</w:t>
-      </w:r>
-      <w:r>
-        <w:rPr>
-          <w:rStyle w:val="citation-82"/>
-          <w:rFonts w:ascii="Verdana" w:hAnsi="Verdana"/>
-          <w:sz w:val="20"/>
-          <w:szCs w:val="20"/>
-        </w:rPr>
-        <w:t xml:space="preserve"> es la funcionalidad de Realizar Pedido de Bocadillos dentro del sistema de la Tienda de bocadillos</w:t>
+        <w:t>El elemento para probar es la funcionalidad de Realizar Pedido de Bocadillos dentro del sistema de la Tienda de bocadillos</w:t>
       </w:r>
       <w:r>
         <w:rPr>
@@ -1705,37 +1600,8 @@
                 <w:lang w:val="es-ES"/>
               </w:rPr>
             </w:pPr>
-            <w:proofErr w:type="spellStart"/>
-            <w:r>
-              <w:t>Flujo</w:t>
-            </w:r>
-            <w:proofErr w:type="spellEnd"/>
-            <w:r>
-              <w:t xml:space="preserve"> </w:t>
-            </w:r>
-            <w:proofErr w:type="spellStart"/>
-            <w:r>
-              <w:t>Básico</w:t>
-            </w:r>
-            <w:proofErr w:type="spellEnd"/>
-            <w:r>
-              <w:t xml:space="preserve"> (</w:t>
-            </w:r>
-            <w:proofErr w:type="spellStart"/>
-            <w:r>
-              <w:t>Compra</w:t>
-            </w:r>
-            <w:proofErr w:type="spellEnd"/>
-            <w:r>
-              <w:t xml:space="preserve"> </w:t>
-            </w:r>
-            <w:proofErr w:type="spellStart"/>
-            <w:r>
-              <w:t>Exitosa</w:t>
-            </w:r>
-            <w:proofErr w:type="spellEnd"/>
-            <w:r>
-              <w:t>)</w:t>
+            <w:r>
+              <w:t>Flujo Básico (Compra Exitosa)</w:t>
             </w:r>
           </w:p>
         </w:tc>
@@ -1807,29 +1673,8 @@
                 <w:lang w:val="es-ES"/>
               </w:rPr>
             </w:pPr>
-            <w:proofErr w:type="spellStart"/>
-            <w:r>
-              <w:t>Flujo</w:t>
-            </w:r>
-            <w:proofErr w:type="spellEnd"/>
-            <w:r>
-              <w:t xml:space="preserve"> Alternativo 2 (</w:t>
-            </w:r>
-            <w:proofErr w:type="spellStart"/>
-            <w:r>
-              <w:t>Carrito</w:t>
-            </w:r>
-            <w:proofErr w:type="spellEnd"/>
-            <w:r>
-              <w:t xml:space="preserve"> </w:t>
-            </w:r>
-            <w:proofErr w:type="spellStart"/>
-            <w:r>
-              <w:t>vacío</w:t>
-            </w:r>
-            <w:proofErr w:type="spellEnd"/>
-            <w:r>
-              <w:t>)</w:t>
+            <w:r>
+              <w:t>Flujo Alternativo 2 (Carrito vacío)</w:t>
             </w:r>
           </w:p>
         </w:tc>
@@ -2117,21 +1962,7 @@
               <w:rPr>
                 <w:lang w:val="es-ES"/>
               </w:rPr>
-              <w:t xml:space="preserve">Usuario </w:t>
-            </w:r>
-            <w:proofErr w:type="spellStart"/>
-            <w:r>
-              <w:rPr>
-                <w:lang w:val="es-ES"/>
-              </w:rPr>
-              <w:t>logueado</w:t>
-            </w:r>
-            <w:proofErr w:type="spellEnd"/>
-            <w:r>
-              <w:rPr>
-                <w:lang w:val="es-ES"/>
-              </w:rPr>
-              <w:t>, bocadillos disponibles. Compra estándar.</w:t>
+              <w:t>Usuario logueado, bocadillos disponibles. Compra estándar.</w:t>
             </w:r>
           </w:p>
         </w:tc>
@@ -2161,21 +1992,7 @@
               <w:rPr>
                 <w:lang w:val="es-ES"/>
               </w:rPr>
-              <w:t>" (</w:t>
-            </w:r>
-            <w:proofErr w:type="spellStart"/>
-            <w:r>
-              <w:rPr>
-                <w:lang w:val="es-ES"/>
-              </w:rPr>
-              <w:t>Cant</w:t>
-            </w:r>
-            <w:proofErr w:type="spellEnd"/>
-            <w:r>
-              <w:rPr>
-                <w:lang w:val="es-ES"/>
-              </w:rPr>
-              <w:t>: 1). Clic en "Tramitar".</w:t>
+              <w:t>" (Cant: 1). Clic en "Tramitar".</w:t>
             </w:r>
           </w:p>
         </w:tc>
@@ -2193,51 +2010,10 @@
               <w:rPr>
                 <w:lang w:val="es-ES"/>
               </w:rPr>
-              <w:t>Nombre: "</w:t>
-            </w:r>
-            <w:proofErr w:type="spellStart"/>
-            <w:r>
-              <w:rPr>
-                <w:lang w:val="es-ES"/>
-              </w:rPr>
-              <w:t>SeleniumUser</w:t>
-            </w:r>
-            <w:proofErr w:type="spellEnd"/>
-            <w:r>
-              <w:rPr>
-                <w:lang w:val="es-ES"/>
-              </w:rPr>
-              <w:t>", Email: "uit@test.com", Pago: "</w:t>
-            </w:r>
-            <w:proofErr w:type="spellStart"/>
-            <w:r>
-              <w:rPr>
-                <w:lang w:val="es-ES"/>
-              </w:rPr>
-              <w:t>GooglePay</w:t>
-            </w:r>
-            <w:proofErr w:type="spellEnd"/>
-            <w:r>
-              <w:rPr>
-                <w:lang w:val="es-ES"/>
-              </w:rPr>
-              <w:t xml:space="preserve">". </w:t>
-            </w:r>
-            <w:proofErr w:type="spellStart"/>
-            <w:r>
-              <w:t>Clic</w:t>
-            </w:r>
-            <w:proofErr w:type="spellEnd"/>
-            <w:r>
-              <w:t xml:space="preserve"> "</w:t>
-            </w:r>
-            <w:proofErr w:type="spellStart"/>
-            <w:r>
-              <w:t>Confirmar</w:t>
-            </w:r>
-            <w:proofErr w:type="spellEnd"/>
-            <w:r>
-              <w:t>".</w:t>
+              <w:t xml:space="preserve">Nombre: "SeleniumUser", Email: "uit@test.com", Pago: "GooglePay". </w:t>
+            </w:r>
+            <w:r>
+              <w:t>Clic "Confirmar".</w:t>
             </w:r>
           </w:p>
         </w:tc>
@@ -2267,35 +2043,7 @@
               <w:rPr>
                 <w:lang w:val="es-ES"/>
               </w:rPr>
-              <w:t xml:space="preserve">El sistema redirige a la página de </w:t>
-            </w:r>
-            <w:proofErr w:type="spellStart"/>
-            <w:r>
-              <w:rPr>
-                <w:lang w:val="es-ES"/>
-              </w:rPr>
-              <w:t>DetallePedido</w:t>
-            </w:r>
-            <w:proofErr w:type="spellEnd"/>
-            <w:r>
-              <w:rPr>
-                <w:lang w:val="es-ES"/>
-              </w:rPr>
-              <w:t>. Muestra los datos del cliente ("</w:t>
-            </w:r>
-            <w:proofErr w:type="spellStart"/>
-            <w:r>
-              <w:rPr>
-                <w:lang w:val="es-ES"/>
-              </w:rPr>
-              <w:t>SeleniumUser</w:t>
-            </w:r>
-            <w:proofErr w:type="spellEnd"/>
-            <w:r>
-              <w:rPr>
-                <w:lang w:val="es-ES"/>
-              </w:rPr>
-              <w:t>") y el método de pago seleccionado.</w:t>
+              <w:t>El sistema redirige a la página de DetallePedido. Muestra los datos del cliente ("SeleniumUser") y el método de pago seleccionado.</w:t>
             </w:r>
           </w:p>
         </w:tc>
@@ -2481,23 +2229,7 @@
               </w:rPr>
             </w:pPr>
             <w:r>
-              <w:t xml:space="preserve">No </w:t>
-            </w:r>
-            <w:proofErr w:type="spellStart"/>
-            <w:r>
-              <w:t>selecciona</w:t>
-            </w:r>
-            <w:proofErr w:type="spellEnd"/>
-            <w:r>
-              <w:t xml:space="preserve"> </w:t>
-            </w:r>
-            <w:proofErr w:type="spellStart"/>
-            <w:r>
-              <w:t>ningún</w:t>
-            </w:r>
-            <w:proofErr w:type="spellEnd"/>
-            <w:r>
-              <w:t xml:space="preserve"> bocadillo.</w:t>
+              <w:t>No selecciona ningún bocadillo.</w:t>
             </w:r>
           </w:p>
         </w:tc>
@@ -2763,21 +2495,7 @@
               <w:rPr>
                 <w:lang w:val="es-ES"/>
               </w:rPr>
-              <w:t>redirige al detalle. Muestra mensajes de validación y mantiene al usuario en la página del formulario (/</w:t>
-            </w:r>
-            <w:proofErr w:type="spellStart"/>
-            <w:r>
-              <w:rPr>
-                <w:lang w:val="es-ES"/>
-              </w:rPr>
-              <w:t>Create</w:t>
-            </w:r>
-            <w:proofErr w:type="spellEnd"/>
-            <w:r>
-              <w:rPr>
-                <w:lang w:val="es-ES"/>
-              </w:rPr>
-              <w:t>)</w:t>
+              <w:t>redirige al detalle. Muestra mensajes de validación y mantiene al usuario en la página del formulario (/Create)</w:t>
             </w:r>
           </w:p>
         </w:tc>
@@ -2848,15 +2566,7 @@
               </w:rPr>
             </w:pPr>
             <w:r>
-              <w:t>Rellena Nombre: "</w:t>
-            </w:r>
-            <w:proofErr w:type="spellStart"/>
-            <w:r>
-              <w:t>NombrePersistente</w:t>
-            </w:r>
-            <w:proofErr w:type="spellEnd"/>
-            <w:r>
-              <w:t>".</w:t>
+              <w:t>Rellena Nombre: "NombrePersistente".</w:t>
             </w:r>
           </w:p>
         </w:tc>
@@ -2886,21 +2596,7 @@
               <w:rPr>
                 <w:lang w:val="es-ES"/>
               </w:rPr>
-              <w:t>Al volver al formulario, el campo "Nombre" mantiene el valor "</w:t>
-            </w:r>
-            <w:proofErr w:type="spellStart"/>
-            <w:r>
-              <w:rPr>
-                <w:lang w:val="es-ES"/>
-              </w:rPr>
-              <w:t>NombrePersistente</w:t>
-            </w:r>
-            <w:proofErr w:type="spellEnd"/>
-            <w:r>
-              <w:rPr>
-                <w:lang w:val="es-ES"/>
-              </w:rPr>
-              <w:t>" introducido previamente (Persistencia de estado)</w:t>
+              <w:t>Al volver al formulario, el campo "Nombre" mantiene el valor "NombrePersistente" introducido previamente (Persistencia de estado)</w:t>
             </w:r>
           </w:p>
         </w:tc>
@@ -3028,25 +2724,7 @@
           <w:sz w:val="20"/>
           <w:szCs w:val="20"/>
         </w:rPr>
-        <w:t xml:space="preserve">Navegador Microsoft Edge (para pruebas </w:t>
-      </w:r>
-      <w:proofErr w:type="spellStart"/>
-      <w:r>
-        <w:rPr>
-          <w:rFonts w:ascii="Verdana" w:hAnsi="Verdana"/>
-          <w:sz w:val="20"/>
-          <w:szCs w:val="20"/>
-        </w:rPr>
-        <w:t>Selenium</w:t>
-      </w:r>
-      <w:proofErr w:type="spellEnd"/>
-      <w:r>
-        <w:rPr>
-          <w:rFonts w:ascii="Verdana" w:hAnsi="Verdana"/>
-          <w:sz w:val="20"/>
-          <w:szCs w:val="20"/>
-        </w:rPr>
-        <w:t>).</w:t>
+        <w:t>Navegador Microsoft Edge (para pruebas Selenium).</w:t>
       </w:r>
     </w:p>
     <w:p>
@@ -3224,27 +2902,119 @@
       <w:bookmarkEnd w:id="16"/>
       <w:bookmarkEnd w:id="17"/>
     </w:p>
-    <w:bookmarkEnd w:id="1"/>
     <w:bookmarkEnd w:id="2"/>
+    <w:bookmarkEnd w:id="3"/>
     <w:p>
       <w:pPr>
         <w:rPr>
           <w:lang w:val="es-ES"/>
         </w:rPr>
       </w:pPr>
-      <w:proofErr w:type="spellStart"/>
-      <w:r>
-        <w:rPr>
-          <w:lang w:val="es-ES"/>
-        </w:rPr>
-        <w:t>Login</w:t>
-      </w:r>
-      <w:proofErr w:type="spellEnd"/>
-      <w:r>
-        <w:rPr>
-          <w:lang w:val="es-ES"/>
-        </w:rPr>
-        <w:t xml:space="preserve"> de Usuario: Aunque el sistema permite emails anónimos, se recomienda un usuario registrado si se valida la autenticación en el controlador.</w:t>
+      <w:r>
+        <w:rPr>
+          <w:lang w:val="es-ES"/>
+        </w:rPr>
+        <w:t>Login de Usuario: Aunque el sistema permite emails anónimos, se recomienda un usuario registrado si se valida la autenticación en el controlador.</w:t>
+      </w:r>
+      <w:r>
+        <w:rPr>
+          <w:lang w:val="es-ES"/>
+        </w:rPr>
+        <w:br/>
+      </w:r>
+      <w:r>
+        <w:rPr>
+          <w:lang w:val="es-ES"/>
+        </w:rPr>
+        <w:br/>
+        <w:t>Datos con los que trabajo:</w:t>
+      </w:r>
+    </w:p>
+    <w:p>
+      <w:pPr>
+        <w:rPr>
+          <w:lang w:val="es-ES"/>
+        </w:rPr>
+      </w:pPr>
+      <w:r>
+        <w:rPr>
+          <w:lang w:val="es-ES"/>
+        </w:rPr>
+        <w:drawing>
+          <wp:inline distT="0" distB="0" distL="0" distR="0" wp14:anchorId="21B2ABA0" wp14:editId="5DEDC79F">
+            <wp:extent cx="2467319" cy="743054"/>
+            <wp:effectExtent l="0" t="0" r="0" b="0"/>
+            <wp:docPr id="676535314" name="Imagen 1" descr="Imagen que contiene Interfaz de usuario gráfica&#10;&#10;El contenido generado por IA puede ser incorrecto."/>
+            <wp:cNvGraphicFramePr>
+              <a:graphicFrameLocks xmlns:a="http://schemas.openxmlformats.org/drawingml/2006/main" noChangeAspect="1"/>
+            </wp:cNvGraphicFramePr>
+            <a:graphic xmlns:a="http://schemas.openxmlformats.org/drawingml/2006/main">
+              <a:graphicData uri="http://schemas.openxmlformats.org/drawingml/2006/picture">
+                <pic:pic xmlns:pic="http://schemas.openxmlformats.org/drawingml/2006/picture">
+                  <pic:nvPicPr>
+                    <pic:cNvPr id="676535314" name="Imagen 1" descr="Imagen que contiene Interfaz de usuario gráfica&#10;&#10;El contenido generado por IA puede ser incorrecto."/>
+                    <pic:cNvPicPr/>
+                  </pic:nvPicPr>
+                  <pic:blipFill>
+                    <a:blip r:embed="rId11"/>
+                    <a:stretch>
+                      <a:fillRect/>
+                    </a:stretch>
+                  </pic:blipFill>
+                  <pic:spPr>
+                    <a:xfrm>
+                      <a:off x="0" y="0"/>
+                      <a:ext cx="2467319" cy="743054"/>
+                    </a:xfrm>
+                    <a:prstGeom prst="rect">
+                      <a:avLst/>
+                    </a:prstGeom>
+                  </pic:spPr>
+                </pic:pic>
+              </a:graphicData>
+            </a:graphic>
+          </wp:inline>
+        </w:drawing>
+      </w:r>
+      <w:r>
+        <w:rPr>
+          <w:lang w:val="es-ES"/>
+        </w:rPr>
+        <w:drawing>
+          <wp:inline distT="0" distB="0" distL="0" distR="0" wp14:anchorId="1D0C463D" wp14:editId="4952043F">
+            <wp:extent cx="6735115" cy="885949"/>
+            <wp:effectExtent l="0" t="0" r="0" b="9525"/>
+            <wp:docPr id="468147929" name="Imagen 1" descr="Interfaz de usuario gráfica, Aplicación&#10;&#10;El contenido generado por IA puede ser incorrecto."/>
+            <wp:cNvGraphicFramePr>
+              <a:graphicFrameLocks xmlns:a="http://schemas.openxmlformats.org/drawingml/2006/main" noChangeAspect="1"/>
+            </wp:cNvGraphicFramePr>
+            <a:graphic xmlns:a="http://schemas.openxmlformats.org/drawingml/2006/main">
+              <a:graphicData uri="http://schemas.openxmlformats.org/drawingml/2006/picture">
+                <pic:pic xmlns:pic="http://schemas.openxmlformats.org/drawingml/2006/picture">
+                  <pic:nvPicPr>
+                    <pic:cNvPr id="468147929" name="Imagen 1" descr="Interfaz de usuario gráfica, Aplicación&#10;&#10;El contenido generado por IA puede ser incorrecto."/>
+                    <pic:cNvPicPr/>
+                  </pic:nvPicPr>
+                  <pic:blipFill>
+                    <a:blip r:embed="rId12"/>
+                    <a:stretch>
+                      <a:fillRect/>
+                    </a:stretch>
+                  </pic:blipFill>
+                  <pic:spPr>
+                    <a:xfrm>
+                      <a:off x="0" y="0"/>
+                      <a:ext cx="6735115" cy="885949"/>
+                    </a:xfrm>
+                    <a:prstGeom prst="rect">
+                      <a:avLst/>
+                    </a:prstGeom>
+                  </pic:spPr>
+                </pic:pic>
+              </a:graphicData>
+            </a:graphic>
+          </wp:inline>
+        </w:drawing>
       </w:r>
     </w:p>
     <w:sectPr>
@@ -3557,26 +3327,11 @@
           <w:tcW w:w="6379" w:type="dxa"/>
         </w:tcPr>
         <w:p>
-          <w:r>
-            <w:fldChar w:fldCharType="begin"/>
-          </w:r>
-          <w:r>
-            <w:instrText xml:space="preserve"> TITLE  \* MERGEFORMAT </w:instrText>
-          </w:r>
-          <w:r>
-            <w:fldChar w:fldCharType="separate"/>
-          </w:r>
-          <w:r>
-            <w:t xml:space="preserve">Casos de </w:t>
-          </w:r>
-          <w:proofErr w:type="spellStart"/>
-          <w:r>
-            <w:t>Pruebas</w:t>
-          </w:r>
-          <w:proofErr w:type="spellEnd"/>
-          <w:r>
-            <w:fldChar w:fldCharType="end"/>
-          </w:r>
+          <w:fldSimple w:instr=" TITLE  \* MERGEFORMAT ">
+            <w:r>
+              <w:t>Casos de Pruebas</w:t>
+            </w:r>
+          </w:fldSimple>
         </w:p>
       </w:tc>
       <w:tc>
@@ -3585,15 +3340,7 @@
         </w:tcPr>
         <w:p>
           <w:r>
-            <w:t xml:space="preserve">  </w:t>
-          </w:r>
-          <w:proofErr w:type="spellStart"/>
-          <w:r>
-            <w:t>Fecha</w:t>
-          </w:r>
-          <w:proofErr w:type="spellEnd"/>
-          <w:r>
-            <w:t xml:space="preserve">:  </w:t>
+            <w:t xml:space="preserve">  Fecha:  </w:t>
           </w:r>
           <w:r>
             <w:t>13/12/2025</w:t>
@@ -4559,6 +4306,7 @@
   <w:style w:type="character" w:default="1" w:styleId="Fuentedeprrafopredeter">
     <w:name w:val="Default Paragraph Font"/>
     <w:uiPriority w:val="1"/>
+    <w:semiHidden/>
     <w:unhideWhenUsed/>
   </w:style>
   <w:style w:type="table" w:default="1" w:styleId="Tablanormal">

</xml_diff>